<commit_message>
ACP 0900193-90: v5 — petição de cadastro com objeto, art. 272 §4º e art. 106 I, endereço para intimações
Co-Authored-By: Claude Fable 5.1 <noreply@anthropic.com>
Claude-Session: https://claude.ai/code/session_01CCVbA1mc4UdnaFNsukuTYT
</commit_message>
<xml_diff>
--- a/juridico/ACP-0900193-90.2016.8.24.0064/2026-09-02-cumprimento-ev25/pecas/03-regularizacao-cadastro-intimacao-exclusiva.docx
+++ b/juridico/ACP-0900193-90.2016.8.24.0064/2026-09-02-cumprimento-ev25/pecas/03-regularizacao-cadastro-intimacao-exclusiva.docx
@@ -86,6 +86,22 @@
     </w:p>
     <w:p>
       <w:pPr>
+        <w:keepNext/>
+        <w:keepLines/>
+        <w:spacing w:after="120" w:line="360"/>
+        <w:jc w:val="center"/>
+      </w:pPr>
+      <w:r>
+        <w:rPr>
+          <w:rFonts w:ascii="Times New Roman" w:cs="Times New Roman" w:eastAsia="Times New Roman" w:hAnsi="Times New Roman"/>
+          <w:sz w:val="24"/>
+          <w:szCs w:val="24"/>
+        </w:rPr>
+        <w:t xml:space="preserve">Origem: Ação Civil Pública n. 0900193-90.2016.8.24.0064 — Vara da Fazenda Pública da Comarca de São José</w:t>
+      </w:r>
+    </w:p>
+    <w:p>
+      <w:pPr>
         <w:keepNext w:val="false"/>
         <w:keepLines/>
         <w:spacing w:after="120" w:line="360"/>
@@ -129,82 +145,22 @@
           <w:sz w:val="24"/>
           <w:szCs w:val="24"/>
         </w:rPr>
-        <w:t xml:space="preserve">I — Os fatos</w:t>
-      </w:r>
-    </w:p>
-    <w:p>
-      <w:pPr>
-        <w:spacing w:after="120" w:line="360"/>
-        <w:ind w:firstLine="709"/>
-        <w:jc w:val="both"/>
-      </w:pPr>
-      <w:r>
-        <w:rPr>
-          <w:rFonts w:ascii="Times New Roman" w:cs="Times New Roman" w:eastAsia="Times New Roman" w:hAnsi="Times New Roman"/>
-          <w:sz w:val="24"/>
-          <w:szCs w:val="24"/>
-        </w:rPr>
-        <w:t xml:space="preserve">1. Constam do cadastro de procuradores da apelante, nestes autos e nos autos de origem, além do subscritor, as advogadas Caroline Vaz (OAB/SC 54.142) e Lígia Luis (OAB/SC 53.624).</w:t>
-      </w:r>
-    </w:p>
-    <w:p>
-      <w:pPr>
-        <w:spacing w:after="120" w:line="360"/>
-        <w:ind w:firstLine="709"/>
-        <w:jc w:val="both"/>
-      </w:pPr>
-      <w:r>
-        <w:rPr>
-          <w:rFonts w:ascii="Times New Roman" w:cs="Times New Roman" w:eastAsia="Times New Roman" w:hAnsi="Times New Roman"/>
-          <w:sz w:val="24"/>
-          <w:szCs w:val="24"/>
-        </w:rPr>
-        <w:t xml:space="preserve">2. Ambas renunciaram ao mandato em 01/08/2023 (Evento 211 dos autos de origem), com prova da comunicação à mandante (notificação de 11/07/2023 e mensagem eletrônica de 31/07/2023), e reiteraram o pedido de desabilitação em 22/01/2025 (Evento 256). Os pedidos não foram apreciados, e as renunciantes permanecem habilitadas nos dois graus.</w:t>
-      </w:r>
-    </w:p>
-    <w:p>
-      <w:pPr>
-        <w:spacing w:after="120" w:line="360"/>
-        <w:ind w:firstLine="709"/>
-        <w:jc w:val="both"/>
-      </w:pPr>
-      <w:r>
-        <w:rPr>
-          <w:rFonts w:ascii="Times New Roman" w:cs="Times New Roman" w:eastAsia="Times New Roman" w:hAnsi="Times New Roman"/>
-          <w:sz w:val="24"/>
-          <w:szCs w:val="24"/>
-        </w:rPr>
-        <w:t xml:space="preserve">3. A apelante já requereu, por duas vezes, que as publicações fossem feitas exclusivamente em nome do subscritor (Evento 40, de 04/09/2018, e Evento 65, de 26/08/2019, dos autos de origem), e há registros de publicações em nome de inscrição diversa da sua ("OAB 14870/MS"). [CONFERIR NO EPROC: eventos e datas das publicações com a inscrição errada]</w:t>
-      </w:r>
-    </w:p>
-    <w:p>
-      <w:pPr>
-        <w:spacing w:after="120" w:line="360"/>
-        <w:ind w:firstLine="709"/>
-        <w:jc w:val="both"/>
-      </w:pPr>
-      <w:r>
-        <w:rPr>
-          <w:rFonts w:ascii="Times New Roman" w:cs="Times New Roman" w:eastAsia="Times New Roman" w:hAnsi="Times New Roman"/>
-          <w:sz w:val="24"/>
-          <w:szCs w:val="24"/>
-        </w:rPr>
-        <w:t xml:space="preserve">4. A representação atual da apelante está documentada na procuração e no ato constitutivo juntados com a petição de cumprimento do despacho do Evento 25 (Docs. 2 e 3 daquela petição), protocolada nesta data.</w:t>
-      </w:r>
-    </w:p>
-    <w:p>
-      <w:pPr>
-        <w:spacing w:after="120" w:line="360"/>
-        <w:ind w:firstLine="709"/>
-        <w:jc w:val="both"/>
-      </w:pPr>
-      <w:r>
-        <w:rPr>
-          <w:rFonts w:ascii="Times New Roman" w:cs="Times New Roman" w:eastAsia="Times New Roman" w:hAnsi="Times New Roman"/>
-          <w:sz w:val="24"/>
-          <w:szCs w:val="24"/>
-        </w:rPr>
-        <w:t xml:space="preserve">5. O cadastro deste grau grafa a apelante como "EIRELI". A forma societária é "Ltda." desde a Sétima Alteração Contratual (JUCESC, 08/06/2021), como consta do ato constitutivo juntado e do próprio despacho do Evento 25.</w:t>
+        <w:t xml:space="preserve">I — Do objeto desta petição</w:t>
+      </w:r>
+    </w:p>
+    <w:p>
+      <w:pPr>
+        <w:spacing w:after="120" w:line="360"/>
+        <w:ind w:firstLine="709"/>
+        <w:jc w:val="both"/>
+      </w:pPr>
+      <w:r>
+        <w:rPr>
+          <w:rFonts w:ascii="Times New Roman" w:cs="Times New Roman" w:eastAsia="Times New Roman" w:hAnsi="Times New Roman"/>
+          <w:sz w:val="24"/>
+          <w:szCs w:val="24"/>
+        </w:rPr>
+        <w:t xml:space="preserve">1. Esta petição não tem prazo e não se confunde com a manifestação de cumprimento do despacho do Evento 25, protocolada nesta data. Trata de matéria de ordenação do processo (CPC, art. 932, I): a atualização do cadastro de procuradores da apelante, a forma das intimações que lhe são dirigidas e a grafia de sua denominação na autuação. A procuração atual da apelante e a Sétima Alteração do Contrato Social já foram juntadas com aquela manifestação (Docs. 2 e 3), aos quais a apelante se reporta.</w:t>
       </w:r>
     </w:p>
     <w:p>
@@ -221,52 +177,82 @@
           <w:sz w:val="24"/>
           <w:szCs w:val="24"/>
         </w:rPr>
-        <w:t xml:space="preserve">II — O direito</w:t>
-      </w:r>
-    </w:p>
-    <w:p>
-      <w:pPr>
-        <w:spacing w:after="120" w:line="360"/>
-        <w:ind w:firstLine="709"/>
-        <w:jc w:val="both"/>
-      </w:pPr>
-      <w:r>
-        <w:rPr>
-          <w:rFonts w:ascii="Times New Roman" w:cs="Times New Roman" w:eastAsia="Times New Roman" w:hAnsi="Times New Roman"/>
-          <w:sz w:val="24"/>
-          <w:szCs w:val="24"/>
-        </w:rPr>
-        <w:t xml:space="preserve">6. A renúncia ao mandato, comunicada ao mandante, produz efeitos após o decêndio do art. 112, § 1º, do Código de Processo Civil. Decorrido há muito esse prazo, as renunciantes não representam a apelante, e a manutenção de seus nomes no cadastro só gera o risco de intimações dirigidas a quem não é mais procurador.</w:t>
-      </w:r>
-    </w:p>
-    <w:p>
-      <w:pPr>
-        <w:spacing w:after="120" w:line="360"/>
-        <w:ind w:firstLine="709"/>
-        <w:jc w:val="both"/>
-      </w:pPr>
-      <w:r>
-        <w:rPr>
-          <w:rFonts w:ascii="Times New Roman" w:cs="Times New Roman" w:eastAsia="Times New Roman" w:hAnsi="Times New Roman"/>
-          <w:sz w:val="24"/>
-          <w:szCs w:val="24"/>
-        </w:rPr>
-        <w:t xml:space="preserve">7. O art. 272, § 2º, do CPC assegura que, requerida a intimação em nome de advogado determinado, as publicações contenham o seu nome e o número de sua inscrição; o § 5º do mesmo artigo comina nulidade ao descumprimento. Renova-se, por isso, o requerimento já formulado nos autos de origem.</w:t>
-      </w:r>
-    </w:p>
-    <w:p>
-      <w:pPr>
-        <w:spacing w:after="120" w:line="360"/>
-        <w:ind w:firstLine="709"/>
-        <w:jc w:val="both"/>
-      </w:pPr>
-      <w:r>
-        <w:rPr>
-          <w:rFonts w:ascii="Times New Roman" w:cs="Times New Roman" w:eastAsia="Times New Roman" w:hAnsi="Times New Roman"/>
-          <w:sz w:val="24"/>
-          <w:szCs w:val="24"/>
-        </w:rPr>
-        <w:t xml:space="preserve">8. Cabe ao relator dirigir e ordenar o processo (CPC, art. 932, I). Como os registros do 1º e do 2º grau são distintos, requer-se a comunicação ao juízo de origem, para que a baixa e as anotações se reproduzam nos autos da ação civil pública.</w:t>
+        <w:t xml:space="preserve">II — Os fatos</w:t>
+      </w:r>
+    </w:p>
+    <w:p>
+      <w:pPr>
+        <w:spacing w:after="120" w:line="360"/>
+        <w:ind w:firstLine="709"/>
+        <w:jc w:val="both"/>
+      </w:pPr>
+      <w:r>
+        <w:rPr>
+          <w:rFonts w:ascii="Times New Roman" w:cs="Times New Roman" w:eastAsia="Times New Roman" w:hAnsi="Times New Roman"/>
+          <w:sz w:val="24"/>
+          <w:szCs w:val="24"/>
+        </w:rPr>
+        <w:t xml:space="preserve">2. Constam do cadastro de procuradores da apelante, nestes autos e nos autos de origem, além do subscritor, as advogadas Caroline Vaz (OAB/SC 54.142) e Lígia Luis (OAB/SC 53.624).</w:t>
+      </w:r>
+    </w:p>
+    <w:p>
+      <w:pPr>
+        <w:spacing w:after="120" w:line="360"/>
+        <w:ind w:firstLine="709"/>
+        <w:jc w:val="both"/>
+      </w:pPr>
+      <w:r>
+        <w:rPr>
+          <w:rFonts w:ascii="Times New Roman" w:cs="Times New Roman" w:eastAsia="Times New Roman" w:hAnsi="Times New Roman"/>
+          <w:sz w:val="24"/>
+          <w:szCs w:val="24"/>
+        </w:rPr>
+        <w:t xml:space="preserve">3. Ambas renunciaram ao mandato em 01/08/2023 (Evento 211 dos autos de origem), com prova da comunicação à mandante (notificação de 11/07/2023 e mensagem eletrônica de 31/07/2023), e reiteraram o pedido de desabilitação em 22/01/2025 (Evento 256). Os pedidos não foram apreciados, e as renunciantes permanecem habilitadas nos dois graus.</w:t>
+      </w:r>
+    </w:p>
+    <w:p>
+      <w:pPr>
+        <w:spacing w:after="120" w:line="360"/>
+        <w:ind w:firstLine="709"/>
+        <w:jc w:val="both"/>
+      </w:pPr>
+      <w:r>
+        <w:rPr>
+          <w:rFonts w:ascii="Times New Roman" w:cs="Times New Roman" w:eastAsia="Times New Roman" w:hAnsi="Times New Roman"/>
+          <w:sz w:val="24"/>
+          <w:szCs w:val="24"/>
+        </w:rPr>
+        <w:t xml:space="preserve">4. A apelante já requereu, por duas vezes, que as publicações fossem feitas exclusivamente em nome do subscritor (Evento 40, de 04/09/2018, e Eventos 65/71, de 2019, dos autos de origem), e há registros de publicações em nome de inscrição diversa da sua ("OAB 14870/MS"). [CONFERIR NO EPROC: evento exato do requerimento de 2019 e eventos e datas das publicações com a inscrição errada]</w:t>
+      </w:r>
+    </w:p>
+    <w:p>
+      <w:pPr>
+        <w:spacing w:after="120" w:line="360"/>
+        <w:ind w:firstLine="709"/>
+        <w:jc w:val="both"/>
+      </w:pPr>
+      <w:r>
+        <w:rPr>
+          <w:rFonts w:ascii="Times New Roman" w:cs="Times New Roman" w:eastAsia="Times New Roman" w:hAnsi="Times New Roman"/>
+          <w:sz w:val="24"/>
+          <w:szCs w:val="24"/>
+        </w:rPr>
+        <w:t xml:space="preserve">5. Desde a renúncia, a apelante atua por meio do subscritor: manifestação do Evento 257 dos autos de origem (22/01/2025), subscrita por ele na dupla condição de sócio administrador e advogado, com o contrato social; apelação do Evento 280 (11/05/2026); memoriais do Evento 17 deste recurso (14/08/2026); e, nesta data, a petição de cumprimento do Evento 25, com a procuração atual (Doc. 2 daquela petição).</w:t>
+      </w:r>
+    </w:p>
+    <w:p>
+      <w:pPr>
+        <w:spacing w:after="120" w:line="360"/>
+        <w:ind w:firstLine="709"/>
+        <w:jc w:val="both"/>
+      </w:pPr>
+      <w:r>
+        <w:rPr>
+          <w:rFonts w:ascii="Times New Roman" w:cs="Times New Roman" w:eastAsia="Times New Roman" w:hAnsi="Times New Roman"/>
+          <w:sz w:val="24"/>
+          <w:szCs w:val="24"/>
+        </w:rPr>
+        <w:t xml:space="preserve">6. O cadastro deste grau grafa a apelante como "EIRELI". A forma societária é "Ltda." desde a Sétima Alteração Contratual (JUCESC, 08/06/2021), como consta do ato constitutivo juntado e do próprio despacho do Evento 25.</w:t>
       </w:r>
     </w:p>
     <w:p>
@@ -283,22 +269,84 @@
           <w:sz w:val="24"/>
           <w:szCs w:val="24"/>
         </w:rPr>
-        <w:t xml:space="preserve">III — Pedidos</w:t>
-      </w:r>
-    </w:p>
-    <w:p>
-      <w:pPr>
-        <w:spacing w:after="120" w:line="360"/>
-        <w:ind w:firstLine="709"/>
-        <w:jc w:val="both"/>
-      </w:pPr>
-      <w:r>
-        <w:rPr>
-          <w:rFonts w:ascii="Times New Roman" w:cs="Times New Roman" w:eastAsia="Times New Roman" w:hAnsi="Times New Roman"/>
-          <w:sz w:val="24"/>
-          <w:szCs w:val="24"/>
-        </w:rPr>
-        <w:t xml:space="preserve">9. Ante o exposto, a apelante requer:</w:t>
+        <w:t xml:space="preserve">III — O direito</w:t>
+      </w:r>
+    </w:p>
+    <w:p>
+      <w:pPr>
+        <w:spacing w:after="120" w:line="360"/>
+        <w:ind w:firstLine="709"/>
+        <w:jc w:val="both"/>
+      </w:pPr>
+      <w:r>
+        <w:rPr>
+          <w:rFonts w:ascii="Times New Roman" w:cs="Times New Roman" w:eastAsia="Times New Roman" w:hAnsi="Times New Roman"/>
+          <w:sz w:val="24"/>
+          <w:szCs w:val="24"/>
+        </w:rPr>
+        <w:t xml:space="preserve">7. A hipótese é de renúncia (CPC, art. 112), não de revogação (CPC, art. 111). A renúncia comunicada ao mandante produz efeitos por si; o renunciante continua a representar o mandante apenas nos dez dias seguintes, se necessário para lhe evitar prejuízo (art. 112, § 1º). Exaurido há muito esse prazo, as renunciantes não representam a apelante, e a manutenção de seus nomes no cadastro só gera o risco de intimações dirigidas a quem não é mais procurador. A baixa não deixa a apelante sem procurador: o subscritor está habilitado nos dois graus, subscreveu todos os atos da apelante desde o Evento 257 e tem procuração atual nos autos, juntada nesta data.</w:t>
+      </w:r>
+    </w:p>
+    <w:p>
+      <w:pPr>
+        <w:spacing w:after="120" w:line="360"/>
+        <w:ind w:firstLine="709"/>
+        <w:jc w:val="both"/>
+      </w:pPr>
+      <w:r>
+        <w:rPr>
+          <w:rFonts w:ascii="Times New Roman" w:cs="Times New Roman" w:eastAsia="Times New Roman" w:hAnsi="Times New Roman"/>
+          <w:sz w:val="24"/>
+          <w:szCs w:val="24"/>
+        </w:rPr>
+        <w:t xml:space="preserve">8. O art. 272, § 2º, do CPC exige, sob pena de nulidade, que da publicação constem os nomes das partes e de seus advogados, com o número de inscrição na OAB; o § 4º impõe que a grafia do nome do advogado corresponda à da procuração ou do registro na OAB; e o § 5º dispõe que, constando dos autos pedido expresso para que as comunicações sejam feitas em nome dos advogados indicados, o seu desatendimento implica nulidade. Renova-se, por isso, perante o relator, o requerimento já formulado nos autos de origem, indicando-se o nome, a inscrição e o endereço para as intimações (CPC, art. 106, I): Gabriel Fabrízio do Espírito Santo, OAB/SC 53.040, Rua Angelita Figueiredo, n. 1.596, Sala 1004, Torre B, Bairro Areias, São José/SC, CEP 88.113-710, e-mail gfdoes@gmail.com.</w:t>
+      </w:r>
+    </w:p>
+    <w:p>
+      <w:pPr>
+        <w:spacing w:after="120" w:line="360"/>
+        <w:ind w:firstLine="709"/>
+        <w:jc w:val="both"/>
+      </w:pPr>
+      <w:r>
+        <w:rPr>
+          <w:rFonts w:ascii="Times New Roman" w:cs="Times New Roman" w:eastAsia="Times New Roman" w:hAnsi="Times New Roman"/>
+          <w:sz w:val="24"/>
+          <w:szCs w:val="24"/>
+        </w:rPr>
+        <w:t xml:space="preserve">9. Cabe ao relator dirigir e ordenar o processo (CPC, art. 932, I). Como os registros do 1º e do 2º grau são distintos, requer-se a comunicação ao juízo de origem, para que a baixa e as anotações se reproduzam nos autos da ação civil pública.</w:t>
+      </w:r>
+    </w:p>
+    <w:p>
+      <w:pPr>
+        <w:keepNext/>
+        <w:spacing w:after="180" w:before="360" w:line="360"/>
+        <w:jc w:val="left"/>
+      </w:pPr>
+      <w:r>
+        <w:rPr>
+          <w:rFonts w:ascii="Times New Roman" w:cs="Times New Roman" w:eastAsia="Times New Roman" w:hAnsi="Times New Roman"/>
+          <w:b/>
+          <w:bCs/>
+          <w:sz w:val="24"/>
+          <w:szCs w:val="24"/>
+        </w:rPr>
+        <w:t xml:space="preserve">IV — Pedidos</w:t>
+      </w:r>
+    </w:p>
+    <w:p>
+      <w:pPr>
+        <w:spacing w:after="120" w:line="360"/>
+        <w:ind w:firstLine="709"/>
+        <w:jc w:val="both"/>
+      </w:pPr>
+      <w:r>
+        <w:rPr>
+          <w:rFonts w:ascii="Times New Roman" w:cs="Times New Roman" w:eastAsia="Times New Roman" w:hAnsi="Times New Roman"/>
+          <w:sz w:val="24"/>
+          <w:szCs w:val="24"/>
+        </w:rPr>
+        <w:t xml:space="preserve">10. Ante o exposto, a apelante requer:</w:t>
       </w:r>
     </w:p>
     <w:p>
@@ -358,7 +406,7 @@
           <w:sz w:val="24"/>
           <w:szCs w:val="24"/>
         </w:rPr>
-        <w:t xml:space="preserve">10. A procuração e o ato constitutivo da apelante constam dos Docs. 2 e 3 da petição de cumprimento do despacho do Evento 25, protocolada nesta data, aos quais se reporta.</w:t>
+        <w:t xml:space="preserve">11. A procuração e o ato constitutivo da apelante constam dos Docs. 2 e 3 da petição de cumprimento do despacho do Evento 25, protocolada nesta data, aos quais se reporta; se necessário, serão reapresentados.</w:t>
       </w:r>
     </w:p>
     <w:p>

</xml_diff>

<commit_message>
ACP 0900193-90: v13 — petição de cadastro consolidada (precedência da peça principal, nota sobre a advogada original) com regra de grafia sem número de parágrafo
Co-Authored-By: Claude Fable 5.1 <noreply@anthropic.com>
Claude-Session: https://claude.ai/code/session_01CCVbA1mc4UdnaFNsukuTYT
</commit_message>
<xml_diff>
--- a/juridico/ACP-0900193-90.2016.8.24.0064/2026-09-02-cumprimento-ev25/pecas/03-regularizacao-cadastro-intimacao-exclusiva.docx
+++ b/juridico/ACP-0900193-90.2016.8.24.0064/2026-09-02-cumprimento-ev25/pecas/03-regularizacao-cadastro-intimacao-exclusiva.docx
@@ -65,7 +65,7 @@
           <w:sz w:val="24"/>
           <w:szCs w:val="24"/>
         </w:rPr>
-        <w:t xml:space="preserve">Apelante (litisconsorte passivo): Município de São José</w:t>
+        <w:t xml:space="preserve">Apelante (litisconsorte passivo): Município de São José/SC</w:t>
       </w:r>
     </w:p>
     <w:p>
@@ -176,7 +176,7 @@
           <w:sz w:val="24"/>
           <w:szCs w:val="24"/>
         </w:rPr>
-        <w:t xml:space="preserve">1. Esta petição não está sujeita a prazo e não se confunde com a manifestação de cumprimento do despacho do Evento 25, protocolada nesta data (Evento [CONFERIR NO EPROC: número do evento gerado] destes autos). Trata de matéria de ordenação do processo (CPC, art. 932, I): a atualização do cadastro de procuradores da apelante, a forma das intimações que lhe são dirigidas e a grafia de sua denominação na autuação. Para pronta anotação pelo cadastro, instruem-na a procuração outorgada pela apelante ao subscritor (Doc. 1) e a Sétima Alteração do Contrato Social (Doc. 2), os mesmos instrumentos juntados àquela manifestação (Docs. 2 e 3).</w:t>
+        <w:t xml:space="preserve">1. Esta petição não está sujeita a prazo e não se confunde com a manifestação de cumprimento do despacho do Evento 25, que a precede nestes autos (Evento [CONFERIR NO EPROC: número do evento gerado pela petição principal]). Trata de matéria de ordenação do processo (CPC, art. 932, I): a atualização do cadastro de procuradores da apelante, a forma das intimações que lhe são dirigidas e a grafia de sua denominação na autuação. Para pronta anotação pelo cadastro, instruem-na a procuração outorgada pela apelante ao subscritor (Doc. 1) e a Sétima Alteração do Contrato Social (Doc. 2), os mesmos instrumentos juntados àquela manifestação (Docs. 2 e 3).</w:t>
       </w:r>
     </w:p>
     <w:p>
@@ -208,7 +208,7 @@
           <w:sz w:val="24"/>
           <w:szCs w:val="24"/>
         </w:rPr>
-        <w:t xml:space="preserve">2. Constam do cadastro de procuradores da apelante, nestes autos e nos autos de origem, além do subscritor, as advogadas Caroline Vaz (OAB/SC 54.142) e Lígia Luis (OAB/SC 53.624). [CONFERIR NO EPROC: se Alessandra Cristina Laurindo Arruda, OAB/SC 39.854 (Evento 21 dos autos de origem), ainda consta habilitada; em caso positivo, incluí-la no pedido "a"]</w:t>
+        <w:t xml:space="preserve">2. Constam do cadastro de procuradores da apelante, nestes autos e nos autos de origem, além do subscritor, as advogadas Caroline Vaz (OAB/SC 54.142) e Lígia Luis (OAB/SC 53.624). [CONFERIR NO EPROC: se Alessandra Cristina Laurindo Arruda, OAB/SC 39.854 (Evento 21 dos autos de origem), ainda consta habilitada; em caso positivo, incluí-la no pedido "a" com a redação: "bem como de Alessandra Cristina Laurindo Arruda (OAB/SC 39.854), cujo instrumento foi superado pela procuração ora juntada"]</w:t>
       </w:r>
     </w:p>
     <w:p>
@@ -253,7 +253,7 @@
           <w:sz w:val="24"/>
           <w:szCs w:val="24"/>
         </w:rPr>
-        <w:t xml:space="preserve">5. O cadastro deste grau grafa a apelante como "EIRELI". A forma societária é "Ltda." desde a Sétima Alteração do Contrato Social, arquivada na JUCESC em 08/06/2021 (NIRE 42.2.0661273-1), como consta do ato constitutivo juntado e do próprio despacho do Evento 25 [CONFERIR NO EPROC: grafia "Ltda." no texto do Evento 25].</w:t>
+        <w:t xml:space="preserve">5. O cadastro deste grau grafa a apelante como "EIRELI". A forma societária é "Ltda." desde a Sétima Alteração do Contrato Social, arquivada na JUCESC em 08/06/2021 (NIRE 42.2.0661273-1), como consta do ato constitutivo juntado e do próprio despacho do Evento 25 [CONFERIR NO EPROC: grafia "Ltda." no texto do Evento 25, DESPADEC1].</w:t>
       </w:r>
     </w:p>
     <w:p>
@@ -300,7 +300,7 @@
           <w:sz w:val="24"/>
           <w:szCs w:val="24"/>
         </w:rPr>
-        <w:t xml:space="preserve">7. O art. 272, § 2º, do CPC exige, sob pena de nulidade, que da publicação constem os nomes das partes e de seus advogados, com o número de inscrição na OAB; o mesmo artigo impõe que a grafia do nome do advogado corresponda ao nome completo constante da procuração ou do registro na OAB; e o § 5º dispõe que, constando dos autos pedido expresso para que as comunicações sejam feitas em nome dos advogados indicados, o seu desatendimento implica nulidade. Requer-se, por isso, com base nesses dispositivos, que todas as comunicações dos atos processuais dirigidas à apelante, inclusive a intimação de pauta, sejam feitas exclusivamente em nome de seu procurador constituído, com os dados que constam da procuração (CPC, art. 105, § 2º): Gabriel Fabrízio do Espírito Santo, OAB/SC 53.040, Rua Angelita Figueiredo, n. 1.596, Sala 1004, Torre B, Bairro Areias, São José/SC, CEP 88.113-710, endereço eletrônico gfdoes@gmail.com.</w:t>
+        <w:t xml:space="preserve">7. O art. 272, § 2º, do CPC exige, sob pena de nulidade, que da publicação constem os nomes das partes e de seus advogados, com o número de inscrição na OAB; o mesmo artigo impõe que a grafia do nome do advogado corresponda ao nome completo e seja a mesma que constar da procuração ou do registro na OAB; e o § 5º dispõe que, constando dos autos pedido expresso para que as comunicações sejam feitas em nome dos advogados indicados, o seu desatendimento implica nulidade. Requer-se, por isso, com base nesses dispositivos, que todas as comunicações dos atos processuais dirigidas à apelante, inclusive a intimação de pauta, sejam feitas exclusivamente em nome de seu procurador constituído, com os dados que constam da procuração (CPC, art. 105, § 2º): Gabriel Fabrízio do Espírito Santo, OAB/SC 53.040, Rua Angelita Figueiredo, n. 1.596, Sala 1004, Torre B, Bairro Areias, São José/SC, CEP 88.113-710, endereço eletrônico gfdoes@gmail.com.</w:t>
       </w:r>
     </w:p>
     <w:p>
@@ -457,7 +457,7 @@
           <w:sz w:val="24"/>
           <w:szCs w:val="24"/>
         </w:rPr>
-        <w:t xml:space="preserve">São José/SC, 2 de setembro de 2026.</w:t>
+        <w:t xml:space="preserve">São José/SC, 03 de setembro de 2026. [CONFERIR: data do protocolo efetivo desta peça, igual ou posterior à da petição principal]</w:t>
       </w:r>
     </w:p>
     <w:p>

</xml_diff>